<commit_message>
feat(diarias): perfis de policiais, geração conjunta e impressão de PDF
- Perfis de Diárias: campos, validação, persistência e painel em Configurações > Policial > Diárias
- Geração conjunta dos nove campos (mapa, requerimentos, declaração) com plano de impressão
- Impressão em processo isolado (GDI) com ordem, vias e primeira página da escala
- Modelos atualizados (mapa .xlsx com fontes/fórmulas, requerimentos, meios próprios)
- FFmpeg: waveform, prévia de áudio da junção, marcadores de transição e layout dos players
- Ícones/estilos das ferramentas e ajustes de layout (IMEI, QR Code, histórico)
</commit_message>
<xml_diff>
--- a/modelos/modelo_meios_proprios.docx
+++ b/modelos/modelo_meios_proprios.docx
@@ -163,7 +163,7 @@
           <w:sz w:val="28"/>
           <w:szCs w:val="28"/>
         </w:rPr>
-        <w:t>GUSTAVO SILVA ALMEIDA</w:t>
+        <w:t>{{{nome}}}</w:t>
       </w:r>
       <w:r>
         <w:rPr>
@@ -177,7 +177,23 @@
           <w:sz w:val="28"/>
           <w:szCs w:val="28"/>
         </w:rPr>
-        <w:t>45.027.980-7</w:t>
+        <w:t>{{{</w:t>
+      </w:r>
+      <w:proofErr w:type="spellStart"/>
+      <w:r>
+        <w:rPr>
+          <w:sz w:val="28"/>
+          <w:szCs w:val="28"/>
+        </w:rPr>
+        <w:t>rg</w:t>
+      </w:r>
+      <w:proofErr w:type="spellEnd"/>
+      <w:r>
+        <w:rPr>
+          <w:sz w:val="28"/>
+          <w:szCs w:val="28"/>
+        </w:rPr>
+        <w:t xml:space="preserve">}}} </w:t>
       </w:r>
       <w:r>
         <w:rPr>
@@ -191,7 +207,23 @@
           <w:sz w:val="28"/>
           <w:szCs w:val="28"/>
         </w:rPr>
-        <w:t>369.002.488-96</w:t>
+        <w:t>{{{</w:t>
+      </w:r>
+      <w:proofErr w:type="spellStart"/>
+      <w:r>
+        <w:rPr>
+          <w:sz w:val="28"/>
+          <w:szCs w:val="28"/>
+        </w:rPr>
+        <w:t>cpf</w:t>
+      </w:r>
+      <w:proofErr w:type="spellEnd"/>
+      <w:r>
+        <w:rPr>
+          <w:sz w:val="28"/>
+          <w:szCs w:val="28"/>
+        </w:rPr>
+        <w:t>}}}</w:t>
       </w:r>
       <w:r>
         <w:rPr>
@@ -205,35 +237,91 @@
           <w:sz w:val="28"/>
           <w:szCs w:val="28"/>
         </w:rPr>
-        <w:t xml:space="preserve">Agente Policial de </w:t>
-      </w:r>
-      <w:r>
-        <w:rPr>
-          <w:sz w:val="28"/>
-          <w:szCs w:val="28"/>
-        </w:rPr>
-        <w:t>Segunda</w:t>
-      </w:r>
-      <w:r>
-        <w:rPr>
-          <w:sz w:val="28"/>
-          <w:szCs w:val="28"/>
-        </w:rPr>
-        <w:t xml:space="preserve"> Classe, Padrão I</w:t>
-      </w:r>
-      <w:r>
-        <w:rPr>
-          <w:sz w:val="28"/>
-          <w:szCs w:val="28"/>
-        </w:rPr>
-        <w:t>I</w:t>
-      </w:r>
-      <w:r>
-        <w:rPr>
-          <w:sz w:val="28"/>
-          <w:szCs w:val="28"/>
-        </w:rPr>
-        <w:t xml:space="preserve">, em exercício na Delegacia de Polícia de </w:t>
+        <w:t>{{{cargo}}}</w:t>
+      </w:r>
+      <w:r>
+        <w:rPr>
+          <w:sz w:val="28"/>
+          <w:szCs w:val="28"/>
+        </w:rPr>
+        <w:t xml:space="preserve"> de </w:t>
+      </w:r>
+      <w:r>
+        <w:rPr>
+          <w:sz w:val="28"/>
+          <w:szCs w:val="28"/>
+        </w:rPr>
+        <w:t>{{{classe}}}</w:t>
+      </w:r>
+      <w:r>
+        <w:rPr>
+          <w:sz w:val="28"/>
+          <w:szCs w:val="28"/>
+        </w:rPr>
+        <w:t xml:space="preserve">, </w:t>
+      </w:r>
+      <w:r>
+        <w:rPr>
+          <w:sz w:val="28"/>
+          <w:szCs w:val="28"/>
+        </w:rPr>
+        <w:t>{{{padrão}}}</w:t>
+      </w:r>
+      <w:r>
+        <w:rPr>
+          <w:sz w:val="28"/>
+          <w:szCs w:val="28"/>
+        </w:rPr>
+        <w:t xml:space="preserve">, em exercício na </w:t>
+      </w:r>
+      <w:r>
+        <w:rPr>
+          <w:sz w:val="28"/>
+          <w:szCs w:val="28"/>
+        </w:rPr>
+        <w:t>{{{delegacia}}}</w:t>
+      </w:r>
+      <w:r>
+        <w:rPr>
+          <w:sz w:val="28"/>
+          <w:szCs w:val="28"/>
+        </w:rPr>
+        <w:t xml:space="preserve">, Seccional </w:t>
+      </w:r>
+      <w:r>
+        <w:rPr>
+          <w:sz w:val="28"/>
+          <w:szCs w:val="28"/>
+        </w:rPr>
+        <w:t xml:space="preserve">de </w:t>
+      </w:r>
+      <w:r>
+        <w:rPr>
+          <w:sz w:val="28"/>
+          <w:szCs w:val="28"/>
+        </w:rPr>
+        <w:t>Avaré, Deinter7-Sorocaba, brasileir</w:t>
+      </w:r>
+      <w:r>
+        <w:rPr>
+          <w:sz w:val="28"/>
+          <w:szCs w:val="28"/>
+        </w:rPr>
+        <w:t>o</w:t>
+      </w:r>
+      <w:r>
+        <w:rPr>
+          <w:sz w:val="28"/>
+          <w:szCs w:val="28"/>
+        </w:rPr>
+        <w:t xml:space="preserve">, </w:t>
+      </w:r>
+      <w:r>
+        <w:rPr>
+          <w:sz w:val="28"/>
+          <w:szCs w:val="28"/>
+        </w:rPr>
+        <w:t>{{{</w:t>
       </w:r>
       <w:proofErr w:type="spellStart"/>
       <w:r>
@@ -241,7 +329,7 @@
           <w:sz w:val="28"/>
           <w:szCs w:val="28"/>
         </w:rPr>
-        <w:t>Taguaí</w:t>
+        <w:t>estado_civil</w:t>
       </w:r>
       <w:proofErr w:type="spellEnd"/>
       <w:r>
@@ -249,7 +337,42 @@
           <w:sz w:val="28"/>
           <w:szCs w:val="28"/>
         </w:rPr>
-        <w:t xml:space="preserve">, Seccional </w:t>
+        <w:t>}}}</w:t>
+      </w:r>
+      <w:r>
+        <w:rPr>
+          <w:sz w:val="28"/>
+          <w:szCs w:val="28"/>
+        </w:rPr>
+        <w:t>, nascid</w:t>
+      </w:r>
+      <w:r>
+        <w:rPr>
+          <w:sz w:val="28"/>
+          <w:szCs w:val="28"/>
+        </w:rPr>
+        <w:t>o</w:t>
+      </w:r>
+      <w:r>
+        <w:rPr>
+          <w:sz w:val="28"/>
+          <w:szCs w:val="28"/>
+        </w:rPr>
+        <w:t xml:space="preserve"> aos </w:t>
+      </w:r>
+      <w:r>
+        <w:rPr>
+          <w:sz w:val="28"/>
+          <w:szCs w:val="28"/>
+        </w:rPr>
+        <w:t>{{{nascimento}}}</w:t>
+      </w:r>
+      <w:r>
+        <w:rPr>
+          <w:sz w:val="28"/>
+          <w:szCs w:val="28"/>
+        </w:rPr>
+        <w:t xml:space="preserve">, natural </w:t>
       </w:r>
       <w:r>
         <w:rPr>
@@ -263,7 +386,30 @@
           <w:sz w:val="28"/>
           <w:szCs w:val="28"/>
         </w:rPr>
-        <w:t>Avaré, Deinter7-Sorocaba, brasileir</w:t>
+        <w:t>{{{</w:t>
+      </w:r>
+      <w:proofErr w:type="spellStart"/>
+      <w:r>
+        <w:rPr>
+          <w:sz w:val="28"/>
+          <w:szCs w:val="28"/>
+        </w:rPr>
+        <w:t>natural_de</w:t>
+      </w:r>
+      <w:proofErr w:type="spellEnd"/>
+      <w:r>
+        <w:rPr>
+          <w:sz w:val="28"/>
+          <w:szCs w:val="28"/>
+        </w:rPr>
+        <w:t>}}}</w:t>
+      </w:r>
+      <w:r>
+        <w:rPr>
+          <w:sz w:val="28"/>
+          <w:szCs w:val="28"/>
+        </w:rPr>
+        <w:t>, filh</w:t>
       </w:r>
       <w:r>
         <w:rPr>
@@ -277,70 +423,28 @@
           <w:sz w:val="28"/>
           <w:szCs w:val="28"/>
         </w:rPr>
-        <w:t>, solteir</w:t>
-      </w:r>
-      <w:r>
-        <w:rPr>
-          <w:sz w:val="28"/>
-          <w:szCs w:val="28"/>
-        </w:rPr>
-        <w:t>o</w:t>
-      </w:r>
-      <w:r>
-        <w:rPr>
-          <w:sz w:val="28"/>
-          <w:szCs w:val="28"/>
-        </w:rPr>
-        <w:t>, nascid</w:t>
-      </w:r>
-      <w:r>
-        <w:rPr>
-          <w:sz w:val="28"/>
-          <w:szCs w:val="28"/>
-        </w:rPr>
-        <w:t>o</w:t>
-      </w:r>
-      <w:r>
-        <w:rPr>
-          <w:sz w:val="28"/>
-          <w:szCs w:val="28"/>
-        </w:rPr>
-        <w:t xml:space="preserve"> aos </w:t>
-      </w:r>
-      <w:r>
-        <w:rPr>
-          <w:sz w:val="28"/>
-          <w:szCs w:val="28"/>
-        </w:rPr>
-        <w:t>01</w:t>
-      </w:r>
-      <w:r>
-        <w:rPr>
-          <w:sz w:val="28"/>
-          <w:szCs w:val="28"/>
-        </w:rPr>
-        <w:t>/09/19</w:t>
-      </w:r>
-      <w:r>
-        <w:rPr>
-          <w:sz w:val="28"/>
-          <w:szCs w:val="28"/>
-        </w:rPr>
-        <w:t>88</w:t>
-      </w:r>
-      <w:r>
-        <w:rPr>
-          <w:sz w:val="28"/>
-          <w:szCs w:val="28"/>
-        </w:rPr>
-        <w:t xml:space="preserve">, natural </w:t>
-      </w:r>
-      <w:r>
-        <w:rPr>
-          <w:sz w:val="28"/>
-          <w:szCs w:val="28"/>
-        </w:rPr>
-        <w:t xml:space="preserve">de Santa Cruz do Rio </w:t>
+        <w:t xml:space="preserve"> de </w:t>
+      </w:r>
+      <w:r>
+        <w:rPr>
+          <w:sz w:val="28"/>
+          <w:szCs w:val="28"/>
+        </w:rPr>
+        <w:t>{{{pai}}}</w:t>
+      </w:r>
+      <w:r>
+        <w:rPr>
+          <w:sz w:val="28"/>
+          <w:szCs w:val="28"/>
+        </w:rPr>
+        <w:t xml:space="preserve"/>
+      </w:r>
+      <w:r>
+        <w:rPr>
+          <w:sz w:val="28"/>
+          <w:szCs w:val="28"/>
+        </w:rPr>
+        <w:t>{{{</w:t>
       </w:r>
       <w:proofErr w:type="spellStart"/>
       <w:r>
@@ -348,7 +452,184 @@
           <w:sz w:val="28"/>
           <w:szCs w:val="28"/>
         </w:rPr>
-        <w:t>Pardo</w:t>
+        <w:t>mae</w:t>
+      </w:r>
+      <w:proofErr w:type="spellEnd"/>
+      <w:r>
+        <w:rPr>
+          <w:sz w:val="28"/>
+          <w:szCs w:val="28"/>
+        </w:rPr>
+        <w:t>}}}</w:t>
+      </w:r>
+      <w:r>
+        <w:rPr>
+          <w:sz w:val="28"/>
+          <w:szCs w:val="28"/>
+        </w:rPr>
+        <w:t>, residente à</w:t>
+      </w:r>
+      <w:r>
+        <w:rPr>
+          <w:sz w:val="28"/>
+          <w:szCs w:val="28"/>
+        </w:rPr>
+        <w:t xml:space="preserve"> </w:t>
+      </w:r>
+      <w:r>
+        <w:rPr>
+          <w:sz w:val="28"/>
+          <w:szCs w:val="28"/>
+        </w:rPr>
+        <w:t>{{{</w:t>
+      </w:r>
+      <w:proofErr w:type="spellStart"/>
+      <w:r>
+        <w:rPr>
+          <w:sz w:val="28"/>
+          <w:szCs w:val="28"/>
+        </w:rPr>
+        <w:t>endereco</w:t>
+      </w:r>
+      <w:proofErr w:type="spellEnd"/>
+      <w:r>
+        <w:rPr>
+          <w:sz w:val="28"/>
+          <w:szCs w:val="28"/>
+        </w:rPr>
+        <w:t>}}}-SP</w:t>
+      </w:r>
+      <w:r>
+        <w:rPr>
+          <w:sz w:val="28"/>
+          <w:szCs w:val="28"/>
+        </w:rPr>
+        <w:t xml:space="preserve">,  </w:t>
+      </w:r>
+      <w:r>
+        <w:rPr>
+          <w:sz w:val="28"/>
+          <w:szCs w:val="28"/>
+        </w:rPr>
+        <w:t xml:space="preserve">atendendo determinação contida na Escala de Plantão Policial Permanente da Central de Polícia Judiciária de </w:t>
+      </w:r>
+      <w:r>
+        <w:rPr>
+          <w:sz w:val="28"/>
+          <w:szCs w:val="28"/>
+        </w:rPr>
+        <w:t>{{{</w:t>
+      </w:r>
+      <w:proofErr w:type="spellStart"/>
+      <w:r>
+        <w:rPr>
+          <w:sz w:val="28"/>
+          <w:szCs w:val="28"/>
+        </w:rPr>
+        <w:t>cidade_plantao</w:t>
+      </w:r>
+      <w:proofErr w:type="spellEnd"/>
+      <w:r>
+        <w:rPr>
+          <w:sz w:val="28"/>
+          <w:szCs w:val="28"/>
+        </w:rPr>
+        <w:t>}}}</w:t>
+      </w:r>
+      <w:r>
+        <w:rPr>
+          <w:sz w:val="28"/>
+          <w:szCs w:val="28"/>
+        </w:rPr>
+        <w:t xml:space="preserve">-referente </w:t>
+      </w:r>
+      <w:r>
+        <w:rPr>
+          <w:sz w:val="28"/>
+          <w:szCs w:val="28"/>
+        </w:rPr>
+        <w:t>{{{</w:t>
+      </w:r>
+      <w:proofErr w:type="spellStart"/>
+      <w:r>
+        <w:rPr>
+          <w:sz w:val="28"/>
+          <w:szCs w:val="28"/>
+        </w:rPr>
+        <w:t>mes_e_ano</w:t>
+      </w:r>
+      <w:proofErr w:type="spellEnd"/>
+      <w:r>
+        <w:rPr>
+          <w:sz w:val="28"/>
+          <w:szCs w:val="28"/>
+        </w:rPr>
+        <w:t>}}}</w:t>
+      </w:r>
+      <w:r>
+        <w:rPr>
+          <w:sz w:val="28"/>
+          <w:szCs w:val="28"/>
+        </w:rPr>
+        <w:t>, subscrita</w:t>
+      </w:r>
+      <w:r>
+        <w:rPr>
+          <w:sz w:val="28"/>
+          <w:szCs w:val="28"/>
+        </w:rPr>
+        <w:t xml:space="preserve"> pela </w:t>
+      </w:r>
+      <w:r>
+        <w:rPr>
+          <w:sz w:val="28"/>
+          <w:szCs w:val="28"/>
+        </w:rPr>
+        <w:t xml:space="preserve">Autoridade Policial </w:t>
+      </w:r>
+      <w:r>
+        <w:rPr>
+          <w:sz w:val="28"/>
+          <w:szCs w:val="28"/>
+        </w:rPr>
+        <w:t>responsável pela referida Central</w:t>
+      </w:r>
+      <w:r>
+        <w:rPr>
+          <w:sz w:val="28"/>
+          <w:szCs w:val="28"/>
+        </w:rPr>
+        <w:t xml:space="preserve">, </w:t>
+      </w:r>
+      <w:r>
+        <w:rPr>
+          <w:sz w:val="28"/>
+          <w:szCs w:val="28"/>
+        </w:rPr>
+        <w:t xml:space="preserve">declaro que abri mão do uso de viatura policial, oficial ou descaracterizada, para o deslocamento até </w:t>
+      </w:r>
+      <w:r>
+        <w:rPr>
+          <w:sz w:val="28"/>
+          <w:szCs w:val="28"/>
+        </w:rPr>
+        <w:t>{{{</w:t>
+      </w:r>
+      <w:proofErr w:type="spellStart"/>
+      <w:r>
+        <w:rPr>
+          <w:sz w:val="28"/>
+          <w:szCs w:val="28"/>
+        </w:rPr>
+        <w:t>cidade_plantao</w:t>
+      </w:r>
+      <w:proofErr w:type="spellEnd"/>
+      <w:r>
+        <w:rPr>
+          <w:sz w:val="28"/>
+          <w:szCs w:val="28"/>
+        </w:rPr>
+        <w:t>}}}</w:t>
       </w:r>
       <w:r>
         <w:rPr>
@@ -356,172 +637,6 @@
           <w:szCs w:val="28"/>
         </w:rPr>
         <w:t>-SP</w:t>
-      </w:r>
-      <w:proofErr w:type="spellEnd"/>
-      <w:r>
-        <w:rPr>
-          <w:sz w:val="28"/>
-          <w:szCs w:val="28"/>
-        </w:rPr>
-        <w:t>, filh</w:t>
-      </w:r>
-      <w:r>
-        <w:rPr>
-          <w:sz w:val="28"/>
-          <w:szCs w:val="28"/>
-        </w:rPr>
-        <w:t>o</w:t>
-      </w:r>
-      <w:r>
-        <w:rPr>
-          <w:sz w:val="28"/>
-          <w:szCs w:val="28"/>
-        </w:rPr>
-        <w:t xml:space="preserve"> de </w:t>
-      </w:r>
-      <w:r>
-        <w:rPr>
-          <w:sz w:val="28"/>
-          <w:szCs w:val="28"/>
-        </w:rPr>
-        <w:t>Paulo Celestino de Almeida e Maria Benedita da Silva Almeida</w:t>
-      </w:r>
-      <w:r>
-        <w:rPr>
-          <w:sz w:val="28"/>
-          <w:szCs w:val="28"/>
-        </w:rPr>
-        <w:t>, residente à</w:t>
-      </w:r>
-      <w:r>
-        <w:rPr>
-          <w:sz w:val="28"/>
-          <w:szCs w:val="28"/>
-        </w:rPr>
-        <w:t xml:space="preserve"> </w:t>
-      </w:r>
-      <w:r>
-        <w:rPr>
-          <w:sz w:val="28"/>
-          <w:szCs w:val="28"/>
-        </w:rPr>
-        <w:t>Rua Dona Beni</w:t>
-      </w:r>
-      <w:r>
-        <w:rPr>
-          <w:sz w:val="28"/>
-          <w:szCs w:val="28"/>
-        </w:rPr>
-        <w:t xml:space="preserve">, </w:t>
-      </w:r>
-      <w:r>
-        <w:rPr>
-          <w:sz w:val="28"/>
-          <w:szCs w:val="28"/>
-        </w:rPr>
-        <w:t>378</w:t>
-      </w:r>
-      <w:r>
-        <w:rPr>
-          <w:sz w:val="28"/>
-          <w:szCs w:val="28"/>
-        </w:rPr>
-        <w:t xml:space="preserve">, </w:t>
-      </w:r>
-      <w:proofErr w:type="spellStart"/>
-      <w:r>
-        <w:rPr>
-          <w:sz w:val="28"/>
-          <w:szCs w:val="28"/>
-        </w:rPr>
-        <w:t>Taguaí</w:t>
-      </w:r>
-      <w:proofErr w:type="spellEnd"/>
-      <w:r>
-        <w:rPr>
-          <w:sz w:val="28"/>
-          <w:szCs w:val="28"/>
-        </w:rPr>
-        <w:t>-SP</w:t>
-      </w:r>
-      <w:r>
-        <w:rPr>
-          <w:sz w:val="28"/>
-          <w:szCs w:val="28"/>
-        </w:rPr>
-        <w:t xml:space="preserve">,  </w:t>
-      </w:r>
-      <w:r>
-        <w:rPr>
-          <w:sz w:val="28"/>
-          <w:szCs w:val="28"/>
-        </w:rPr>
-        <w:t xml:space="preserve">atendendo determinação contida na Escala de Plantão Policial Permanente da Central de Polícia Judiciária de Taquarituba-referente </w:t>
-      </w:r>
-      <w:r>
-        <w:rPr>
-          <w:sz w:val="28"/>
-          <w:szCs w:val="28"/>
-        </w:rPr>
-        <w:t>{{{</w:t>
-      </w:r>
-      <w:proofErr w:type="spellStart"/>
-      <w:r>
-        <w:rPr>
-          <w:sz w:val="28"/>
-          <w:szCs w:val="28"/>
-        </w:rPr>
-        <w:t>mes_e_ano</w:t>
-      </w:r>
-      <w:proofErr w:type="spellEnd"/>
-      <w:r>
-        <w:rPr>
-          <w:sz w:val="28"/>
-          <w:szCs w:val="28"/>
-        </w:rPr>
-        <w:t>}}}</w:t>
-      </w:r>
-      <w:r>
-        <w:rPr>
-          <w:sz w:val="28"/>
-          <w:szCs w:val="28"/>
-        </w:rPr>
-        <w:t>, subscrita</w:t>
-      </w:r>
-      <w:r>
-        <w:rPr>
-          <w:sz w:val="28"/>
-          <w:szCs w:val="28"/>
-        </w:rPr>
-        <w:t xml:space="preserve"> pela </w:t>
-      </w:r>
-      <w:r>
-        <w:rPr>
-          <w:sz w:val="28"/>
-          <w:szCs w:val="28"/>
-        </w:rPr>
-        <w:t xml:space="preserve">Autoridade Policial </w:t>
-      </w:r>
-      <w:r>
-        <w:rPr>
-          <w:sz w:val="28"/>
-          <w:szCs w:val="28"/>
-        </w:rPr>
-        <w:t>responsável pela referida Central</w:t>
-      </w:r>
-      <w:r>
-        <w:rPr>
-          <w:sz w:val="28"/>
-          <w:szCs w:val="28"/>
-        </w:rPr>
-        <w:t xml:space="preserve">, </w:t>
-      </w:r>
-      <w:r>
-        <w:rPr>
-          <w:sz w:val="28"/>
-          <w:szCs w:val="28"/>
-        </w:rPr>
-        <w:t>declaro que abri mão do uso de viatura policial, oficial ou descaracterizada, para o deslocamento até Taquarituba-SP</w:t>
       </w:r>
       <w:r>
         <w:rPr>
@@ -608,15 +723,29 @@
           <w:szCs w:val="28"/>
         </w:rPr>
       </w:pPr>
+      <w:r>
+        <w:rPr>
+          <w:sz w:val="28"/>
+          <w:szCs w:val="28"/>
+        </w:rPr>
+        <w:t>{{{</w:t>
+      </w:r>
       <w:proofErr w:type="spellStart"/>
       <w:r>
         <w:rPr>
           <w:sz w:val="28"/>
           <w:szCs w:val="28"/>
         </w:rPr>
-        <w:t>Taguaí</w:t>
+        <w:t>cidade_atual</w:t>
       </w:r>
       <w:proofErr w:type="spellEnd"/>
+      <w:r>
+        <w:rPr>
+          <w:sz w:val="28"/>
+          <w:szCs w:val="28"/>
+        </w:rPr>
+        <w:t>}}}</w:t>
+      </w:r>
       <w:r>
         <w:rPr>
           <w:sz w:val="28"/>
@@ -703,7 +832,16 @@
           <w:sz w:val="28"/>
           <w:szCs w:val="28"/>
         </w:rPr>
-        <w:t xml:space="preserve">         GUSTAVO SILVA ALMEIDA</w:t>
+        <w:t xml:space="preserve">         </w:t>
+      </w:r>
+      <w:r>
+        <w:rPr>
+          <w:b/>
+          <w:bCs/>
+          <w:sz w:val="28"/>
+          <w:szCs w:val="28"/>
+        </w:rPr>
+        <w:t>{{{nome}}}</w:t>
       </w:r>
     </w:p>
     <w:p>
@@ -730,18 +868,8 @@
           <w:sz w:val="28"/>
           <w:szCs w:val="28"/>
         </w:rPr>
-        <w:t>AGENTE POLICIAL</w:t>
-      </w:r>
-    </w:p>
-    <w:p>
-      <w:pPr>
-        <w:ind w:right="-702"/>
-        <w:jc w:val="center"/>
-        <w:rPr>
-          <w:sz w:val="28"/>
-          <w:szCs w:val="28"/>
-        </w:rPr>
-      </w:pPr>
+        <w:t>{{{cargo}}}</w:t>
+      </w:r>
     </w:p>
     <w:sectPr>
       <w:pgSz w:w="12240" w:h="15840"/>
@@ -780,6 +908,50 @@
     <w:lsdException w:name="Subtitle" w:qFormat="1"/>
     <w:lsdException w:name="Strong" w:qFormat="1"/>
     <w:lsdException w:name="Emphasis" w:qFormat="1"/>
+    <w:lsdException w:name="Normal Table" w:semiHidden="1" w:unhideWhenUsed="1"/>
+    <w:lsdException w:name="Table Simple 1" w:semiHidden="1" w:unhideWhenUsed="1"/>
+    <w:lsdException w:name="Table Simple 2" w:semiHidden="1" w:unhideWhenUsed="1"/>
+    <w:lsdException w:name="Table Simple 3" w:semiHidden="1" w:unhideWhenUsed="1"/>
+    <w:lsdException w:name="Table Classic 1" w:semiHidden="1" w:unhideWhenUsed="1"/>
+    <w:lsdException w:name="Table Classic 2" w:semiHidden="1" w:unhideWhenUsed="1"/>
+    <w:lsdException w:name="Table Classic 3" w:semiHidden="1" w:unhideWhenUsed="1"/>
+    <w:lsdException w:name="Table Classic 4" w:semiHidden="1" w:unhideWhenUsed="1"/>
+    <w:lsdException w:name="Table Colorful 1" w:semiHidden="1" w:unhideWhenUsed="1"/>
+    <w:lsdException w:name="Table Colorful 2" w:semiHidden="1" w:unhideWhenUsed="1"/>
+    <w:lsdException w:name="Table Colorful 3" w:semiHidden="1" w:unhideWhenUsed="1"/>
+    <w:lsdException w:name="Table Columns 1" w:semiHidden="1" w:unhideWhenUsed="1"/>
+    <w:lsdException w:name="Table Columns 2" w:semiHidden="1" w:unhideWhenUsed="1"/>
+    <w:lsdException w:name="Table Columns 3" w:semiHidden="1" w:unhideWhenUsed="1"/>
+    <w:lsdException w:name="Table Columns 4" w:semiHidden="1" w:unhideWhenUsed="1"/>
+    <w:lsdException w:name="Table Columns 5" w:semiHidden="1" w:unhideWhenUsed="1"/>
+    <w:lsdException w:name="Table Grid 1" w:semiHidden="1" w:unhideWhenUsed="1"/>
+    <w:lsdException w:name="Table Grid 2" w:semiHidden="1" w:unhideWhenUsed="1"/>
+    <w:lsdException w:name="Table Grid 3" w:semiHidden="1" w:unhideWhenUsed="1"/>
+    <w:lsdException w:name="Table Grid 4" w:semiHidden="1" w:unhideWhenUsed="1"/>
+    <w:lsdException w:name="Table Grid 5" w:semiHidden="1" w:unhideWhenUsed="1"/>
+    <w:lsdException w:name="Table Grid 6" w:semiHidden="1" w:unhideWhenUsed="1"/>
+    <w:lsdException w:name="Table Grid 7" w:semiHidden="1" w:unhideWhenUsed="1"/>
+    <w:lsdException w:name="Table Grid 8" w:semiHidden="1" w:unhideWhenUsed="1"/>
+    <w:lsdException w:name="Table List 1" w:semiHidden="1" w:unhideWhenUsed="1"/>
+    <w:lsdException w:name="Table List 2" w:semiHidden="1" w:unhideWhenUsed="1"/>
+    <w:lsdException w:name="Table List 3" w:semiHidden="1" w:unhideWhenUsed="1"/>
+    <w:lsdException w:name="Table List 4" w:semiHidden="1" w:unhideWhenUsed="1"/>
+    <w:lsdException w:name="Table List 5" w:semiHidden="1" w:unhideWhenUsed="1"/>
+    <w:lsdException w:name="Table List 6" w:semiHidden="1" w:unhideWhenUsed="1"/>
+    <w:lsdException w:name="Table List 7" w:semiHidden="1" w:unhideWhenUsed="1"/>
+    <w:lsdException w:name="Table List 8" w:semiHidden="1" w:unhideWhenUsed="1"/>
+    <w:lsdException w:name="Table 3D effects 1" w:semiHidden="1" w:unhideWhenUsed="1"/>
+    <w:lsdException w:name="Table 3D effects 2" w:semiHidden="1" w:unhideWhenUsed="1"/>
+    <w:lsdException w:name="Table 3D effects 3" w:semiHidden="1" w:unhideWhenUsed="1"/>
+    <w:lsdException w:name="Table Contemporary" w:semiHidden="1" w:unhideWhenUsed="1"/>
+    <w:lsdException w:name="Table Elegant" w:semiHidden="1" w:unhideWhenUsed="1"/>
+    <w:lsdException w:name="Table Professional" w:semiHidden="1" w:unhideWhenUsed="1"/>
+    <w:lsdException w:name="Table Subtle 1" w:semiHidden="1" w:unhideWhenUsed="1"/>
+    <w:lsdException w:name="Table Subtle 2" w:semiHidden="1" w:unhideWhenUsed="1"/>
+    <w:lsdException w:name="Table Web 1" w:semiHidden="1" w:unhideWhenUsed="1"/>
+    <w:lsdException w:name="Table Web 2" w:semiHidden="1" w:unhideWhenUsed="1"/>
+    <w:lsdException w:name="Table Web 3" w:semiHidden="1" w:unhideWhenUsed="1"/>
+    <w:lsdException w:name="Table Theme" w:semiHidden="1" w:unhideWhenUsed="1"/>
     <w:lsdException w:name="Placeholder Text" w:semiHidden="1" w:uiPriority="99"/>
     <w:lsdException w:name="No Spacing" w:uiPriority="1" w:qFormat="1"/>
     <w:lsdException w:name="Light Shading" w:uiPriority="60"/>
@@ -1012,11 +1184,15 @@
   </w:style>
   <w:style w:type="character" w:default="1" w:styleId="Fontepargpadro">
     <w:name w:val="Default Paragraph Font"/>
+    <w:uiPriority w:val="1"/>
     <w:semiHidden/>
+    <w:unhideWhenUsed/>
   </w:style>
   <w:style w:type="table" w:default="1" w:styleId="Tabelanormal">
     <w:name w:val="Normal Table"/>
+    <w:uiPriority w:val="99"/>
     <w:semiHidden/>
+    <w:unhideWhenUsed/>
     <w:tblPr>
       <w:tblInd w:w="0" w:type="dxa"/>
       <w:tblCellMar>
@@ -1029,7 +1205,9 @@
   </w:style>
   <w:style w:type="numbering" w:default="1" w:styleId="Semlista">
     <w:name w:val="No List"/>
+    <w:uiPriority w:val="99"/>
     <w:semiHidden/>
+    <w:unhideWhenUsed/>
   </w:style>
   <w:style w:type="table" w:styleId="Tabelacomgrade">
     <w:name w:val="Table Grid"/>

</xml_diff>